<commit_message>
Restructure lab 6 report into assignment and execution stages
</commit_message>
<xml_diff>
--- a/lab06_ai_detective/report.docx
+++ b/lab06_ai_detective/report.docx
@@ -296,7 +296,7 @@
       <w:r>
         <w:fldChar w:fldCharType="separate"/>
       </w:r>
-      <w:hyperlink w:anchor="_Toc239791154" w:history="1">
+      <w:hyperlink w:anchor="_Toc240461292" w:history="1">
         <w:r>
           <w:rPr>
             <w:rStyle w:val="aff8"/>
@@ -324,7 +324,7 @@
             <w:noProof/>
             <w:webHidden/>
           </w:rPr>
-          <w:instrText xml:space="preserve"> PAGEREF _Toc239791154 \h </w:instrText>
+          <w:instrText xml:space="preserve"> PAGEREF _Toc240461292 \h </w:instrText>
         </w:r>
         <w:r>
           <w:rPr>
@@ -369,14 +369,14 @@
           <w:lang w:val="ru-RU" w:eastAsia="ru-RU"/>
         </w:rPr>
       </w:pPr>
-      <w:hyperlink w:anchor="_Toc239791155" w:history="1">
+      <w:hyperlink w:anchor="_Toc240461293" w:history="1">
         <w:r>
           <w:rPr>
             <w:rStyle w:val="aff8"/>
             <w:rFonts w:eastAsiaTheme="majorEastAsia"/>
             <w:noProof/>
           </w:rPr>
-          <w:t>1 Выполнение работы</w:t>
+          <w:t>1 Задание</w:t>
         </w:r>
         <w:r>
           <w:rPr>
@@ -397,7 +397,7 @@
             <w:noProof/>
             <w:webHidden/>
           </w:rPr>
-          <w:instrText xml:space="preserve"> PAGEREF _Toc239791155 \h </w:instrText>
+          <w:instrText xml:space="preserve"> PAGEREF _Toc240461293 \h </w:instrText>
         </w:r>
         <w:r>
           <w:rPr>
@@ -430,7 +430,7 @@
     </w:p>
     <w:p>
       <w:pPr>
-        <w:pStyle w:val="2c"/>
+        <w:pStyle w:val="14"/>
         <w:tabs>
           <w:tab w:val="right" w:leader="dot" w:pos="9345"/>
         </w:tabs>
@@ -442,14 +442,14 @@
           <w:lang w:val="ru-RU" w:eastAsia="ru-RU"/>
         </w:rPr>
       </w:pPr>
-      <w:hyperlink w:anchor="_Toc239791156" w:history="1">
+      <w:hyperlink w:anchor="_Toc240461294" w:history="1">
         <w:r>
           <w:rPr>
             <w:rStyle w:val="aff8"/>
             <w:rFonts w:eastAsiaTheme="majorEastAsia"/>
             <w:noProof/>
           </w:rPr>
-          <w:t>1.1 Методика</w:t>
+          <w:t>2 Ход работы</w:t>
         </w:r>
         <w:r>
           <w:rPr>
@@ -470,80 +470,7 @@
             <w:noProof/>
             <w:webHidden/>
           </w:rPr>
-          <w:instrText xml:space="preserve"> PAGEREF _Toc239791156 \h </w:instrText>
-        </w:r>
-        <w:r>
-          <w:rPr>
-            <w:noProof/>
-            <w:webHidden/>
-          </w:rPr>
-        </w:r>
-        <w:r>
-          <w:rPr>
-            <w:noProof/>
-            <w:webHidden/>
-          </w:rPr>
-          <w:fldChar w:fldCharType="separate"/>
-        </w:r>
-        <w:r>
-          <w:rPr>
-            <w:noProof/>
-            <w:webHidden/>
-          </w:rPr>
-          <w:t>4</w:t>
-        </w:r>
-        <w:r>
-          <w:rPr>
-            <w:noProof/>
-            <w:webHidden/>
-          </w:rPr>
-          <w:fldChar w:fldCharType="end"/>
-        </w:r>
-      </w:hyperlink>
-    </w:p>
-    <w:p>
-      <w:pPr>
-        <w:pStyle w:val="2c"/>
-        <w:tabs>
-          <w:tab w:val="right" w:leader="dot" w:pos="9345"/>
-        </w:tabs>
-        <w:rPr>
-          <w:rFonts w:asciiTheme="minorHAnsi" w:eastAsiaTheme="minorEastAsia" w:hAnsiTheme="minorHAnsi"/>
-          <w:noProof/>
-          <w:color w:val="auto"/>
-          <w:sz w:val="22"/>
-          <w:lang w:val="ru-RU" w:eastAsia="ru-RU"/>
-        </w:rPr>
-      </w:pPr>
-      <w:hyperlink w:anchor="_Toc239791157" w:history="1">
-        <w:r>
-          <w:rPr>
-            <w:rStyle w:val="aff8"/>
-            <w:rFonts w:eastAsiaTheme="majorEastAsia"/>
-            <w:noProof/>
-          </w:rPr>
-          <w:t>1.2 Проверка и результаты</w:t>
-        </w:r>
-        <w:r>
-          <w:rPr>
-            <w:noProof/>
-            <w:webHidden/>
-          </w:rPr>
-          <w:tab/>
-        </w:r>
-        <w:r>
-          <w:rPr>
-            <w:noProof/>
-            <w:webHidden/>
-          </w:rPr>
-          <w:fldChar w:fldCharType="begin"/>
-        </w:r>
-        <w:r>
-          <w:rPr>
-            <w:noProof/>
-            <w:webHidden/>
-          </w:rPr>
-          <w:instrText xml:space="preserve"> PAGEREF _Toc239791157 \h </w:instrText>
+          <w:instrText xml:space="preserve"> PAGEREF _Toc240461294 \h </w:instrText>
         </w:r>
         <w:r>
           <w:rPr>
@@ -588,14 +515,14 @@
           <w:lang w:val="ru-RU" w:eastAsia="ru-RU"/>
         </w:rPr>
       </w:pPr>
-      <w:hyperlink w:anchor="_Toc239791158" w:history="1">
+      <w:hyperlink w:anchor="_Toc240461295" w:history="1">
         <w:r>
           <w:rPr>
             <w:rStyle w:val="aff8"/>
             <w:rFonts w:eastAsiaTheme="majorEastAsia"/>
             <w:noProof/>
           </w:rPr>
-          <w:t>1.3 Обсуждение и ограничения</w:t>
+          <w:t>2.1 Этап 1. Досье, утверждения и вопросы</w:t>
         </w:r>
         <w:r>
           <w:rPr>
@@ -616,7 +543,153 @@
             <w:noProof/>
             <w:webHidden/>
           </w:rPr>
-          <w:instrText xml:space="preserve"> PAGEREF _Toc239791158 \h </w:instrText>
+          <w:instrText xml:space="preserve"> PAGEREF _Toc240461295 \h </w:instrText>
+        </w:r>
+        <w:r>
+          <w:rPr>
+            <w:noProof/>
+            <w:webHidden/>
+          </w:rPr>
+        </w:r>
+        <w:r>
+          <w:rPr>
+            <w:noProof/>
+            <w:webHidden/>
+          </w:rPr>
+          <w:fldChar w:fldCharType="separate"/>
+        </w:r>
+        <w:r>
+          <w:rPr>
+            <w:noProof/>
+            <w:webHidden/>
+          </w:rPr>
+          <w:t>5</w:t>
+        </w:r>
+        <w:r>
+          <w:rPr>
+            <w:noProof/>
+            <w:webHidden/>
+          </w:rPr>
+          <w:fldChar w:fldCharType="end"/>
+        </w:r>
+      </w:hyperlink>
+    </w:p>
+    <w:p>
+      <w:pPr>
+        <w:pStyle w:val="2c"/>
+        <w:tabs>
+          <w:tab w:val="right" w:leader="dot" w:pos="9345"/>
+        </w:tabs>
+        <w:rPr>
+          <w:rFonts w:asciiTheme="minorHAnsi" w:eastAsiaTheme="minorEastAsia" w:hAnsiTheme="minorHAnsi"/>
+          <w:noProof/>
+          <w:color w:val="auto"/>
+          <w:sz w:val="22"/>
+          <w:lang w:val="ru-RU" w:eastAsia="ru-RU"/>
+        </w:rPr>
+      </w:pPr>
+      <w:hyperlink w:anchor="_Toc240461296" w:history="1">
+        <w:r>
+          <w:rPr>
+            <w:rStyle w:val="aff8"/>
+            <w:rFonts w:eastAsiaTheme="majorEastAsia"/>
+            <w:noProof/>
+          </w:rPr>
+          <w:t>2.2 Этап 2. Режимы сравнения и проверка ответа</w:t>
+        </w:r>
+        <w:r>
+          <w:rPr>
+            <w:noProof/>
+            <w:webHidden/>
+          </w:rPr>
+          <w:tab/>
+        </w:r>
+        <w:r>
+          <w:rPr>
+            <w:noProof/>
+            <w:webHidden/>
+          </w:rPr>
+          <w:fldChar w:fldCharType="begin"/>
+        </w:r>
+        <w:r>
+          <w:rPr>
+            <w:noProof/>
+            <w:webHidden/>
+          </w:rPr>
+          <w:instrText xml:space="preserve"> PAGEREF _Toc240461296 \h </w:instrText>
+        </w:r>
+        <w:r>
+          <w:rPr>
+            <w:noProof/>
+            <w:webHidden/>
+          </w:rPr>
+        </w:r>
+        <w:r>
+          <w:rPr>
+            <w:noProof/>
+            <w:webHidden/>
+          </w:rPr>
+          <w:fldChar w:fldCharType="separate"/>
+        </w:r>
+        <w:r>
+          <w:rPr>
+            <w:noProof/>
+            <w:webHidden/>
+          </w:rPr>
+          <w:t>5</w:t>
+        </w:r>
+        <w:r>
+          <w:rPr>
+            <w:noProof/>
+            <w:webHidden/>
+          </w:rPr>
+          <w:fldChar w:fldCharType="end"/>
+        </w:r>
+      </w:hyperlink>
+    </w:p>
+    <w:p>
+      <w:pPr>
+        <w:pStyle w:val="2c"/>
+        <w:tabs>
+          <w:tab w:val="right" w:leader="dot" w:pos="9345"/>
+        </w:tabs>
+        <w:rPr>
+          <w:rFonts w:asciiTheme="minorHAnsi" w:eastAsiaTheme="minorEastAsia" w:hAnsiTheme="minorHAnsi"/>
+          <w:noProof/>
+          <w:color w:val="auto"/>
+          <w:sz w:val="22"/>
+          <w:lang w:val="ru-RU" w:eastAsia="ru-RU"/>
+        </w:rPr>
+      </w:pPr>
+      <w:hyperlink w:anchor="_Toc240461297" w:history="1">
+        <w:r>
+          <w:rPr>
+            <w:rStyle w:val="aff8"/>
+            <w:rFonts w:eastAsiaTheme="majorEastAsia"/>
+            <w:noProof/>
+          </w:rPr>
+          <w:t>2.3 Этап 3. p-adic организация</w:t>
+        </w:r>
+        <w:r>
+          <w:rPr>
+            <w:noProof/>
+            <w:webHidden/>
+          </w:rPr>
+          <w:tab/>
+        </w:r>
+        <w:r>
+          <w:rPr>
+            <w:noProof/>
+            <w:webHidden/>
+          </w:rPr>
+          <w:fldChar w:fldCharType="begin"/>
+        </w:r>
+        <w:r>
+          <w:rPr>
+            <w:noProof/>
+            <w:webHidden/>
+          </w:rPr>
+          <w:instrText xml:space="preserve"> PAGEREF _Toc240461297 \h </w:instrText>
         </w:r>
         <w:r>
           <w:rPr>
@@ -661,14 +734,14 @@
           <w:lang w:val="ru-RU" w:eastAsia="ru-RU"/>
         </w:rPr>
       </w:pPr>
-      <w:hyperlink w:anchor="_Toc239791159" w:history="1">
+      <w:hyperlink w:anchor="_Toc240461298" w:history="1">
         <w:r>
           <w:rPr>
             <w:rStyle w:val="aff8"/>
             <w:rFonts w:eastAsiaTheme="majorEastAsia"/>
             <w:noProof/>
           </w:rPr>
-          <w:t>1.4 Вклад участников</w:t>
+          <w:t>2.4 Этап 4. Стресс-тесты</w:t>
         </w:r>
         <w:r>
           <w:rPr>
@@ -689,7 +762,226 @@
             <w:noProof/>
             <w:webHidden/>
           </w:rPr>
-          <w:instrText xml:space="preserve"> PAGEREF _Toc239791159 \h </w:instrText>
+          <w:instrText xml:space="preserve"> PAGEREF _Toc240461298 \h </w:instrText>
+        </w:r>
+        <w:r>
+          <w:rPr>
+            <w:noProof/>
+            <w:webHidden/>
+          </w:rPr>
+        </w:r>
+        <w:r>
+          <w:rPr>
+            <w:noProof/>
+            <w:webHidden/>
+          </w:rPr>
+          <w:fldChar w:fldCharType="separate"/>
+        </w:r>
+        <w:r>
+          <w:rPr>
+            <w:noProof/>
+            <w:webHidden/>
+          </w:rPr>
+          <w:t>6</w:t>
+        </w:r>
+        <w:r>
+          <w:rPr>
+            <w:noProof/>
+            <w:webHidden/>
+          </w:rPr>
+          <w:fldChar w:fldCharType="end"/>
+        </w:r>
+      </w:hyperlink>
+    </w:p>
+    <w:p>
+      <w:pPr>
+        <w:pStyle w:val="2c"/>
+        <w:tabs>
+          <w:tab w:val="right" w:leader="dot" w:pos="9345"/>
+        </w:tabs>
+        <w:rPr>
+          <w:rFonts w:asciiTheme="minorHAnsi" w:eastAsiaTheme="minorEastAsia" w:hAnsiTheme="minorHAnsi"/>
+          <w:noProof/>
+          <w:color w:val="auto"/>
+          <w:sz w:val="22"/>
+          <w:lang w:val="ru-RU" w:eastAsia="ru-RU"/>
+        </w:rPr>
+      </w:pPr>
+      <w:hyperlink w:anchor="_Toc240461299" w:history="1">
+        <w:r>
+          <w:rPr>
+            <w:rStyle w:val="aff8"/>
+            <w:rFonts w:eastAsiaTheme="majorEastAsia"/>
+            <w:noProof/>
+          </w:rPr>
+          <w:t>2.5 Этап 5. Приложение и тестирование</w:t>
+        </w:r>
+        <w:r>
+          <w:rPr>
+            <w:noProof/>
+            <w:webHidden/>
+          </w:rPr>
+          <w:tab/>
+        </w:r>
+        <w:r>
+          <w:rPr>
+            <w:noProof/>
+            <w:webHidden/>
+          </w:rPr>
+          <w:fldChar w:fldCharType="begin"/>
+        </w:r>
+        <w:r>
+          <w:rPr>
+            <w:noProof/>
+            <w:webHidden/>
+          </w:rPr>
+          <w:instrText xml:space="preserve"> PAGEREF _Toc240461299 \h </w:instrText>
+        </w:r>
+        <w:r>
+          <w:rPr>
+            <w:noProof/>
+            <w:webHidden/>
+          </w:rPr>
+        </w:r>
+        <w:r>
+          <w:rPr>
+            <w:noProof/>
+            <w:webHidden/>
+          </w:rPr>
+          <w:fldChar w:fldCharType="separate"/>
+        </w:r>
+        <w:r>
+          <w:rPr>
+            <w:noProof/>
+            <w:webHidden/>
+          </w:rPr>
+          <w:t>6</w:t>
+        </w:r>
+        <w:r>
+          <w:rPr>
+            <w:noProof/>
+            <w:webHidden/>
+          </w:rPr>
+          <w:fldChar w:fldCharType="end"/>
+        </w:r>
+      </w:hyperlink>
+    </w:p>
+    <w:p>
+      <w:pPr>
+        <w:pStyle w:val="2c"/>
+        <w:tabs>
+          <w:tab w:val="right" w:leader="dot" w:pos="9345"/>
+        </w:tabs>
+        <w:rPr>
+          <w:rFonts w:asciiTheme="minorHAnsi" w:eastAsiaTheme="minorEastAsia" w:hAnsiTheme="minorHAnsi"/>
+          <w:noProof/>
+          <w:color w:val="auto"/>
+          <w:sz w:val="22"/>
+          <w:lang w:val="ru-RU" w:eastAsia="ru-RU"/>
+        </w:rPr>
+      </w:pPr>
+      <w:hyperlink w:anchor="_Toc240461300" w:history="1">
+        <w:r>
+          <w:rPr>
+            <w:rStyle w:val="aff8"/>
+            <w:rFonts w:eastAsiaTheme="majorEastAsia"/>
+            <w:noProof/>
+          </w:rPr>
+          <w:t>2.6 Этап 6. Метрики и результаты</w:t>
+        </w:r>
+        <w:r>
+          <w:rPr>
+            <w:noProof/>
+            <w:webHidden/>
+          </w:rPr>
+          <w:tab/>
+        </w:r>
+        <w:r>
+          <w:rPr>
+            <w:noProof/>
+            <w:webHidden/>
+          </w:rPr>
+          <w:fldChar w:fldCharType="begin"/>
+        </w:r>
+        <w:r>
+          <w:rPr>
+            <w:noProof/>
+            <w:webHidden/>
+          </w:rPr>
+          <w:instrText xml:space="preserve"> PAGEREF _Toc240461300 \h </w:instrText>
+        </w:r>
+        <w:r>
+          <w:rPr>
+            <w:noProof/>
+            <w:webHidden/>
+          </w:rPr>
+        </w:r>
+        <w:r>
+          <w:rPr>
+            <w:noProof/>
+            <w:webHidden/>
+          </w:rPr>
+          <w:fldChar w:fldCharType="separate"/>
+        </w:r>
+        <w:r>
+          <w:rPr>
+            <w:noProof/>
+            <w:webHidden/>
+          </w:rPr>
+          <w:t>7</w:t>
+        </w:r>
+        <w:r>
+          <w:rPr>
+            <w:noProof/>
+            <w:webHidden/>
+          </w:rPr>
+          <w:fldChar w:fldCharType="end"/>
+        </w:r>
+      </w:hyperlink>
+    </w:p>
+    <w:p>
+      <w:pPr>
+        <w:pStyle w:val="2c"/>
+        <w:tabs>
+          <w:tab w:val="right" w:leader="dot" w:pos="9345"/>
+        </w:tabs>
+        <w:rPr>
+          <w:rFonts w:asciiTheme="minorHAnsi" w:eastAsiaTheme="minorEastAsia" w:hAnsiTheme="minorHAnsi"/>
+          <w:noProof/>
+          <w:color w:val="auto"/>
+          <w:sz w:val="22"/>
+          <w:lang w:val="ru-RU" w:eastAsia="ru-RU"/>
+        </w:rPr>
+      </w:pPr>
+      <w:hyperlink w:anchor="_Toc240461301" w:history="1">
+        <w:r>
+          <w:rPr>
+            <w:rStyle w:val="aff8"/>
+            <w:rFonts w:eastAsiaTheme="majorEastAsia"/>
+            <w:noProof/>
+          </w:rPr>
+          <w:t>2.7 Этап 7. Анализ ошибок и ограничения</w:t>
+        </w:r>
+        <w:r>
+          <w:rPr>
+            <w:noProof/>
+            <w:webHidden/>
+          </w:rPr>
+          <w:tab/>
+        </w:r>
+        <w:r>
+          <w:rPr>
+            <w:noProof/>
+            <w:webHidden/>
+          </w:rPr>
+          <w:fldChar w:fldCharType="begin"/>
+        </w:r>
+        <w:r>
+          <w:rPr>
+            <w:noProof/>
+            <w:webHidden/>
+          </w:rPr>
+          <w:instrText xml:space="preserve"> PAGEREF _Toc240461301 \h </w:instrText>
         </w:r>
         <w:r>
           <w:rPr>
@@ -722,7 +1014,7 @@
     </w:p>
     <w:p>
       <w:pPr>
-        <w:pStyle w:val="14"/>
+        <w:pStyle w:val="2c"/>
         <w:tabs>
           <w:tab w:val="right" w:leader="dot" w:pos="9345"/>
         </w:tabs>
@@ -734,14 +1026,14 @@
           <w:lang w:val="ru-RU" w:eastAsia="ru-RU"/>
         </w:rPr>
       </w:pPr>
-      <w:hyperlink w:anchor="_Toc239791160" w:history="1">
+      <w:hyperlink w:anchor="_Toc240461302" w:history="1">
         <w:r>
           <w:rPr>
             <w:rStyle w:val="aff8"/>
             <w:rFonts w:eastAsiaTheme="majorEastAsia"/>
             <w:noProof/>
           </w:rPr>
-          <w:t>ЗАКЛЮЧЕНИЕ</w:t>
+          <w:t>2.8 Этап 8. Вклад участников и демонстрация</w:t>
         </w:r>
         <w:r>
           <w:rPr>
@@ -762,80 +1054,7 @@
             <w:noProof/>
             <w:webHidden/>
           </w:rPr>
-          <w:instrText xml:space="preserve"> PAGEREF _Toc239791160 \h </w:instrText>
-        </w:r>
-        <w:r>
-          <w:rPr>
-            <w:noProof/>
-            <w:webHidden/>
-          </w:rPr>
-        </w:r>
-        <w:r>
-          <w:rPr>
-            <w:noProof/>
-            <w:webHidden/>
-          </w:rPr>
-          <w:fldChar w:fldCharType="separate"/>
-        </w:r>
-        <w:r>
-          <w:rPr>
-            <w:noProof/>
-            <w:webHidden/>
-          </w:rPr>
-          <w:t>9</w:t>
-        </w:r>
-        <w:r>
-          <w:rPr>
-            <w:noProof/>
-            <w:webHidden/>
-          </w:rPr>
-          <w:fldChar w:fldCharType="end"/>
-        </w:r>
-      </w:hyperlink>
-    </w:p>
-    <w:p>
-      <w:pPr>
-        <w:pStyle w:val="14"/>
-        <w:tabs>
-          <w:tab w:val="right" w:leader="dot" w:pos="9345"/>
-        </w:tabs>
-        <w:rPr>
-          <w:rFonts w:asciiTheme="minorHAnsi" w:eastAsiaTheme="minorEastAsia" w:hAnsiTheme="minorHAnsi"/>
-          <w:noProof/>
-          <w:color w:val="auto"/>
-          <w:sz w:val="22"/>
-          <w:lang w:val="ru-RU" w:eastAsia="ru-RU"/>
-        </w:rPr>
-      </w:pPr>
-      <w:hyperlink w:anchor="_Toc239791161" w:history="1">
-        <w:r>
-          <w:rPr>
-            <w:rStyle w:val="aff8"/>
-            <w:rFonts w:eastAsiaTheme="majorEastAsia"/>
-            <w:noProof/>
-          </w:rPr>
-          <w:t>СПИСОК ИСПОЛЬЗОВАННЫХ ИСТОЧНИКОВ</w:t>
-        </w:r>
-        <w:r>
-          <w:rPr>
-            <w:noProof/>
-            <w:webHidden/>
-          </w:rPr>
-          <w:tab/>
-        </w:r>
-        <w:r>
-          <w:rPr>
-            <w:noProof/>
-            <w:webHidden/>
-          </w:rPr>
-          <w:fldChar w:fldCharType="begin"/>
-        </w:r>
-        <w:r>
-          <w:rPr>
-            <w:noProof/>
-            <w:webHidden/>
-          </w:rPr>
-          <w:instrText xml:space="preserve"> PAGEREF _Toc239791161 \h </w:instrText>
+          <w:instrText xml:space="preserve"> PAGEREF _Toc240461302 \h </w:instrText>
         </w:r>
         <w:r>
           <w:rPr>
@@ -868,6 +1087,152 @@
     </w:p>
     <w:p>
       <w:pPr>
+        <w:pStyle w:val="14"/>
+        <w:tabs>
+          <w:tab w:val="right" w:leader="dot" w:pos="9345"/>
+        </w:tabs>
+        <w:rPr>
+          <w:rFonts w:asciiTheme="minorHAnsi" w:eastAsiaTheme="minorEastAsia" w:hAnsiTheme="minorHAnsi"/>
+          <w:noProof/>
+          <w:color w:val="auto"/>
+          <w:sz w:val="22"/>
+          <w:lang w:val="ru-RU" w:eastAsia="ru-RU"/>
+        </w:rPr>
+      </w:pPr>
+      <w:hyperlink w:anchor="_Toc240461303" w:history="1">
+        <w:r>
+          <w:rPr>
+            <w:rStyle w:val="aff8"/>
+            <w:rFonts w:eastAsiaTheme="majorEastAsia"/>
+            <w:noProof/>
+          </w:rPr>
+          <w:t>ЗАКЛЮЧЕНИЕ</w:t>
+        </w:r>
+        <w:r>
+          <w:rPr>
+            <w:noProof/>
+            <w:webHidden/>
+          </w:rPr>
+          <w:tab/>
+        </w:r>
+        <w:r>
+          <w:rPr>
+            <w:noProof/>
+            <w:webHidden/>
+          </w:rPr>
+          <w:fldChar w:fldCharType="begin"/>
+        </w:r>
+        <w:r>
+          <w:rPr>
+            <w:noProof/>
+            <w:webHidden/>
+          </w:rPr>
+          <w:instrText xml:space="preserve"> PAGEREF _Toc240461303 \h </w:instrText>
+        </w:r>
+        <w:r>
+          <w:rPr>
+            <w:noProof/>
+            <w:webHidden/>
+          </w:rPr>
+        </w:r>
+        <w:r>
+          <w:rPr>
+            <w:noProof/>
+            <w:webHidden/>
+          </w:rPr>
+          <w:fldChar w:fldCharType="separate"/>
+        </w:r>
+        <w:r>
+          <w:rPr>
+            <w:noProof/>
+            <w:webHidden/>
+          </w:rPr>
+          <w:t>11</w:t>
+        </w:r>
+        <w:r>
+          <w:rPr>
+            <w:noProof/>
+            <w:webHidden/>
+          </w:rPr>
+          <w:fldChar w:fldCharType="end"/>
+        </w:r>
+      </w:hyperlink>
+    </w:p>
+    <w:p>
+      <w:pPr>
+        <w:pStyle w:val="14"/>
+        <w:tabs>
+          <w:tab w:val="right" w:leader="dot" w:pos="9345"/>
+        </w:tabs>
+        <w:rPr>
+          <w:rFonts w:asciiTheme="minorHAnsi" w:eastAsiaTheme="minorEastAsia" w:hAnsiTheme="minorHAnsi"/>
+          <w:noProof/>
+          <w:color w:val="auto"/>
+          <w:sz w:val="22"/>
+          <w:lang w:val="ru-RU" w:eastAsia="ru-RU"/>
+        </w:rPr>
+      </w:pPr>
+      <w:hyperlink w:anchor="_Toc240461304" w:history="1">
+        <w:r>
+          <w:rPr>
+            <w:rStyle w:val="aff8"/>
+            <w:rFonts w:eastAsiaTheme="majorEastAsia"/>
+            <w:noProof/>
+          </w:rPr>
+          <w:t>СПИСОК ИСПОЛЬЗОВАННЫХ ИСТОЧНИКОВ</w:t>
+        </w:r>
+        <w:r>
+          <w:rPr>
+            <w:noProof/>
+            <w:webHidden/>
+          </w:rPr>
+          <w:tab/>
+        </w:r>
+        <w:r>
+          <w:rPr>
+            <w:noProof/>
+            <w:webHidden/>
+          </w:rPr>
+          <w:fldChar w:fldCharType="begin"/>
+        </w:r>
+        <w:r>
+          <w:rPr>
+            <w:noProof/>
+            <w:webHidden/>
+          </w:rPr>
+          <w:instrText xml:space="preserve"> PAGEREF _Toc240461304 \h </w:instrText>
+        </w:r>
+        <w:r>
+          <w:rPr>
+            <w:noProof/>
+            <w:webHidden/>
+          </w:rPr>
+        </w:r>
+        <w:r>
+          <w:rPr>
+            <w:noProof/>
+            <w:webHidden/>
+          </w:rPr>
+          <w:fldChar w:fldCharType="separate"/>
+        </w:r>
+        <w:r>
+          <w:rPr>
+            <w:noProof/>
+            <w:webHidden/>
+          </w:rPr>
+          <w:t>12</w:t>
+        </w:r>
+        <w:r>
+          <w:rPr>
+            <w:noProof/>
+            <w:webHidden/>
+          </w:rPr>
+          <w:fldChar w:fldCharType="end"/>
+        </w:r>
+      </w:hyperlink>
+    </w:p>
+    <w:p>
+      <w:pPr>
         <w:ind w:firstLine="0"/>
       </w:pPr>
       <w:r>
@@ -883,7 +1248,7 @@
         <w:ind w:firstLine="0"/>
         <w:jc w:val="center"/>
       </w:pPr>
-      <w:bookmarkStart w:id="1" w:name="_Toc239791154"/>
+      <w:bookmarkStart w:id="1" w:name="_Toc240461292"/>
       <w:r>
         <w:lastRenderedPageBreak/>
         <w:t>ВВЕДЕНИЕ</w:t>
@@ -902,25 +1267,49 @@
       </w:r>
     </w:p>
     <w:p>
+      <w:pPr>
+        <w:pStyle w:val="1"/>
+        <w:keepNext/>
+        <w:pageBreakBefore/>
+        <w:spacing w:after="240"/>
+        <w:jc w:val="left"/>
+      </w:pPr>
+      <w:bookmarkStart w:id="2" w:name="_Toc240461293"/>
       <w:r>
-        <w:t xml:space="preserve">Досье включает карточку инцидента, журнал доступа, регламент, независимые по сценарию сообщения Ильи и Миры, сообщение и переписку Веры, </w:t>
+        <w:lastRenderedPageBreak/>
+        <w:t>1 Задание</w:t>
+      </w:r>
+      <w:bookmarkEnd w:id="2"/>
+    </w:p>
+    <w:p>
+      <w:r>
+        <w:t xml:space="preserve">1. Создать вымышленное досье: 8–10 документов, 5000–8000 слов, временная шкала, свидетели, регламент, исключение, противоречия и </w:t>
       </w:r>
       <w:r>
-        <w:t xml:space="preserve">технический аудит, архив репетиции и план другого турнира. Последние два документа тематически похожи на полезные, но относятся к другим событиям. Мы выделили 36 утверждений с уникальными идентификаторами; каждая доказательная цитата дословно присутствует </w:t>
-      </w:r>
-      <w:r>
-        <w:t>в источнике. Нарративы содержат организационный фон и пояснения, поэтому набор не моделирует случайную выборку производственных документов.</w:t>
+        <w:t>нерелевантные источники.</w:t>
       </w:r>
     </w:p>
     <w:p>
       <w:r>
-        <w:t>Мы составили 12 вопросов: по два прямых, многошаговых, временных, на правило с исключением, противоречие и недостато</w:t>
+        <w:t>2. Выделить 30–40 атомарных утверждений с дословными доказательствами и подготовить 12 вопросов шести типов с эталонами.</w:t>
+      </w:r>
+    </w:p>
+    <w:p>
+      <w:r>
+        <w:t>3. Сравнить одну LLM в режимах полного контекста, BM25 top-15 и p-adic группировки тех же утверждений.</w:t>
+      </w:r>
+    </w:p>
+    <w:p>
+      <w:r>
+        <w:t>4. Выпо</w:t>
       </w:r>
       <w:r>
-        <w:t>к данных. Статусы означают подтверждение или опровержение пропозиции вопроса, конфликт либо недостаточность оснований. При contradicted evidence обосновывает отрицательный ответ; при both два списка ориентированы относительно утвердительной пропозиции. Исх</w:t>
+        <w:t>лнить перестановку документов, удаление необходимой посылки и добавление противоречия.</w:t>
       </w:r>
+    </w:p>
+    <w:p>
       <w:r>
-        <w:t>одные эталоны и варианты зафиксированы хешами до инференса.</w:t>
+        <w:t>5. Реализовать Streamlit-стенд, автоматические тесты и журнал AI_LOG; сравнить метрики, разобрать ошибки и подготовить демонстрацию до семи минут.</w:t>
       </w:r>
     </w:p>
     <w:p>
@@ -931,12 +1320,12 @@
         <w:spacing w:after="240"/>
         <w:jc w:val="left"/>
       </w:pPr>
-      <w:bookmarkStart w:id="2" w:name="_Toc239791155"/>
+      <w:bookmarkStart w:id="3" w:name="_Toc240461294"/>
       <w:r>
         <w:lastRenderedPageBreak/>
-        <w:t>1 Выполнение работы</w:t>
+        <w:t>2 Ход работы</w:t>
       </w:r>
-      <w:bookmarkEnd w:id="2"/>
+      <w:bookmarkEnd w:id="3"/>
     </w:p>
     <w:p>
       <w:pPr>
@@ -945,43 +1334,32 @@
         <w:spacing w:before="240" w:after="240"/>
         <w:jc w:val="left"/>
       </w:pPr>
-      <w:bookmarkStart w:id="3" w:name="_Toc239791156"/>
+      <w:bookmarkStart w:id="4" w:name="_Toc240461295"/>
       <w:r>
-        <w:t>1.1 Методика</w:t>
+        <w:t xml:space="preserve">2.1 Этап </w:t>
       </w:r>
-      <w:bookmarkEnd w:id="3"/>
+      <w:r>
+        <w:t>1. Досье, утверждения и вопросы</w:t>
+      </w:r>
+      <w:bookmarkEnd w:id="4"/>
     </w:p>
     <w:p>
       <w:r>
-        <w:t xml:space="preserve">Режим A получает все документы и реестр идентификаторов для ссылок. BM25 [1] выбирает для B пятнадцать утверждений. Режим C использует строго тот же набор и те же </w:t>
+        <w:t>Досье включает карточку инцидента, журнал доступа, регламент, независимые по сценарию сообщения Ильи и Миры, сообщение и переписку Веры, технический аудит, архив репетиции и план другого турнира. Последние два документа тема</w:t>
       </w:r>
       <w:r>
-        <w:t>поля, изменяя группировку и порядок. Общий транспорт LM Studio [3], модель, системный промпт, temperature=0 и seed=42 одинаковы. Ответ проверяется Pydantic [2]; неизвестные ссылки и both без второй стороны отвергаются. Для insufficient требуется null и ука</w:t>
+        <w:t>тически похожи на полезные, но относятся к другим событиям. Мы выделили 36 утверждений с уникальными идентификаторами; каждая доказательная цитата дословно присутствует в источнике. Нарративы содержат организационный фон и пояснения, поэтому набор не модел</w:t>
       </w:r>
       <w:r>
-        <w:t>зание нехватки информации. Эта лексическая проверка не гарантирует истинности свободного объяснения. Сырые ответы, ошибки, токены, время и точный контекст сохраняются; скрытых повторов нет.</w:t>
+        <w:t>ирует случайную выборку производственных документов.</w:t>
       </w:r>
     </w:p>
     <w:p>
       <w:r>
-        <w:t>Для p=3 путь состоит из типа источника, логической категории и вре</w:t>
+        <w:t xml:space="preserve">Мы составили 12 вопросов: по два прямых, многошаговых, временных, на правило с исключением, противоречие и недостаток данных. Статусы означают подтверждение или опровержение пропозиции вопроса, конфликт </w:t>
       </w:r>
       <w:r>
-        <w:t>менной области. Код равен a₀+3a₁+9a₂. Расстояние определяется длиной общего начального префикса, а не разностью кодов; равные пути имеют расстояние ноль. Внутри ветвей записи сортируются по известному времени. Источник поставлен выше времени, чтобы отдельн</w:t>
-      </w:r>
-      <w:r>
-        <w:t>о показать документальные основания, свидетельства и правила. При первом временном уровне соседними стали бы одновременные сообщения разных источников: это могло бы облегчить сравнение конфликтов, но разделило бы связанные нормы и исключения. Альтернативны</w:t>
-      </w:r>
-      <w:r>
-        <w:t>й порядок в эксперименте не проверялся.</w:t>
-      </w:r>
-    </w:p>
-    <w:p>
-      <w:r>
-        <w:t>Перестановка с seed=42 сохраняет содержание. Удаление одной необходимой посылки применяется к четырём многошаговым/временным вопросам; фрагмент удаляется также из полного документа. Для остальных восьми вопросов этот</w:t>
-      </w:r>
-      <w:r>
-        <w:t xml:space="preserve"> тест неприменим. Добавление одного подготовленного противоречия выполняется для всех вопросов. В Q11/Q12 конфликт касается осведомлённости Веры, не раскрывая искомый факт: ожидаемый статус остаётся insufficient. Всего предусмотрено 120 измерений.</w:t>
+        <w:t>либо недостаточность оснований. При contradicted evidence обосновывает отрицательный ответ; при both два списка ориентированы относительно утвердительной пропозиции. Исходные эталоны и варианты зафиксированы хешами до инференса.</w:t>
       </w:r>
     </w:p>
     <w:p>
@@ -991,30 +1369,130 @@
         <w:spacing w:before="240" w:after="240"/>
         <w:jc w:val="left"/>
       </w:pPr>
-      <w:bookmarkStart w:id="4" w:name="_Toc239791157"/>
+      <w:bookmarkStart w:id="5" w:name="_Toc240461296"/>
       <w:r>
-        <w:lastRenderedPageBreak/>
-        <w:t>1.2 Пров</w:t>
+        <w:t>2.2 Этап 2. Режимы сравнени</w:t>
       </w:r>
       <w:r>
-        <w:t>ерка и результаты</w:t>
+        <w:t>я и проверка ответа</w:t>
       </w:r>
-      <w:bookmarkEnd w:id="4"/>
+      <w:bookmarkEnd w:id="5"/>
     </w:p>
     <w:p>
       <w:r>
-        <w:t xml:space="preserve">Мы выполнили 21 автоматическую проверку, включая все уровни расстояния, ультраметрию на 27³ тройках путей, валидацию, недоступность API, лимит поиска, идентичность B/C и отсутствие удалённого фрагмента. Проверка Streamlit [4] охватила 48 </w:t>
+        <w:t>Режим A получает все документы и реестр идентификаторов для ссылок. BM25 [1] выбирает для B пятнадцать утверждений. Режим C использует строго тот же набор и те же поля, изменяя группировку и порядок. Общий транспорт LM Studio [3], модел</w:t>
       </w:r>
       <w:r>
-        <w:t>состояний без исключений. До подключения LLM средний recall необходимых утверждений в top-15 по исходным вопросам составил 0,896.</w:t>
+        <w:t>ь, системный промпт, temperature=0 и seed=42 одинаковы. Ответ проверяется Pydantic [2]; неизвестные ссылки и both без второй стороны отвергаются. Для insufficient требуется null и указание нехватки информации. Эта лексическая проверка не гарантирует истинн</w:t>
+      </w:r>
+      <w:r>
+        <w:t>ости свободного объяснения. Сырые ответы, ошибки, токены, время и точный контекст сохраняются; скрытых повторов нет.</w:t>
+      </w:r>
+    </w:p>
+    <w:p>
+      <w:pPr>
+        <w:pStyle w:val="21"/>
+        <w:keepNext/>
+        <w:spacing w:before="240" w:after="240"/>
+        <w:jc w:val="left"/>
+      </w:pPr>
+      <w:bookmarkStart w:id="6" w:name="_Toc240461297"/>
+      <w:r>
+        <w:lastRenderedPageBreak/>
+        <w:t>2.3 Этап 3. p-adic организация</w:t>
+      </w:r>
+      <w:bookmarkEnd w:id="6"/>
+    </w:p>
+    <w:p>
+      <w:r>
+        <w:t xml:space="preserve">Для p=3 путь состоит из типа источника, логической категории и временной области. Код равен a₀+3a₁+9a₂. </w:t>
+      </w:r>
+      <w:r>
+        <w:t>Расстояние определяется длиной общего начального префикса, а не разностью кодов; равные пути имеют расстояние ноль. Внутри ветвей записи сортируются по известному времени. Источник поставлен выше времени, чтобы отдельно показать документальные основания, с</w:t>
+      </w:r>
+      <w:r>
+        <w:t>видетельства и правила. При первом временном уровне соседними стали бы одновременные сообщения разных источников: это могло бы облегчить сравнение конфликтов, но разделило бы связанные нормы и исключения. Альтернативный порядок в эксперименте не проверялся</w:t>
+      </w:r>
+      <w:r>
+        <w:t>.</w:t>
+      </w:r>
+    </w:p>
+    <w:p>
+      <w:pPr>
+        <w:pStyle w:val="21"/>
+        <w:keepNext/>
+        <w:spacing w:before="240" w:after="240"/>
+        <w:jc w:val="left"/>
+      </w:pPr>
+      <w:bookmarkStart w:id="7" w:name="_Toc240461298"/>
+      <w:r>
+        <w:t>2.4 Этап 4. Стресс-тесты</w:t>
+      </w:r>
+      <w:bookmarkEnd w:id="7"/>
+    </w:p>
+    <w:p>
+      <w:r>
+        <w:t>Перестановка с seed=42 сохраняет содержание. Удаление одной необходимой посылки применяется к четырём многошаговым/временным вопросам; фрагмент удаляется также из полного документа. Для остальных восьми вопросов этот тест неприме</w:t>
+      </w:r>
+      <w:r>
+        <w:t>ним. Добавление одного подготовленного противоречия выполняется для всех вопросов. В Q11/Q12 конфликт касается осведомлённости Веры, не раскрывая искомый факт: ожидаемый статус остаётся insufficient. Всего предусмотрено 120 измерений.</w:t>
+      </w:r>
+    </w:p>
+    <w:p>
+      <w:pPr>
+        <w:pStyle w:val="21"/>
+        <w:keepNext/>
+        <w:spacing w:before="240" w:after="240"/>
+        <w:jc w:val="left"/>
+      </w:pPr>
+      <w:bookmarkStart w:id="8" w:name="_Toc240461299"/>
+      <w:r>
+        <w:t>2.5 Этап 5. Приложени</w:t>
+      </w:r>
+      <w:r>
+        <w:t>е и тестирование</w:t>
+      </w:r>
+      <w:bookmarkEnd w:id="8"/>
+    </w:p>
+    <w:p>
+      <w:r>
+        <w:t>В app.py реализован стенд Streamlit: загрузка досье, выбор вопроса и режима, показ ответа, confidence, доказательств и контрдоказательств. Доступны три стресс-теста, просмотр p-adic ветвей и сравнение сохранённых результатов. Новые запросы</w:t>
+      </w:r>
+      <w:r>
+        <w:t xml:space="preserve"> сохраняются отдельно от основного эксперимента. AI_LOG.md содержит 12 эпизодов разработки, включая исправления эталонов и кодирования, отклонённые предложения и генерацию тестов.</w:t>
       </w:r>
     </w:p>
     <w:p>
       <w:r>
-        <w:t>Мы выполнили все 120 запросов; 120 ответов прошли формальную валидацию и завершились stop. Хеши эталонов не изменились, фактич</w:t>
+        <w:lastRenderedPageBreak/>
+        <w:t>Мы выполнили 21 автоматическую проверку, включая все уровни расстояния, ульт</w:t>
       </w:r>
       <w:r>
-        <w:t>еские наборы B/C совпали. Израсходовано 688026 входных и 16231 выходной токен; суммарная наблюдаемая задержка составила 1030 с. Это один тёплый прогон, а не оценка холодного старта.</w:t>
+        <w:t>раметрию на 27³ тройках путей, валидацию, недоступность API, лимит поиска, идентичность B/C и отсутствие удалённого фрагмента. Проверка Streamlit [4] охватила 48 состояний без исключений. До подключения LLM средний recall необходимых утверждений в top-15 п</w:t>
+      </w:r>
+      <w:r>
+        <w:t>о исходным вопросам составил 0,896.</w:t>
+      </w:r>
+    </w:p>
+    <w:p>
+      <w:pPr>
+        <w:pStyle w:val="21"/>
+        <w:keepNext/>
+        <w:spacing w:before="240" w:after="240"/>
+        <w:jc w:val="left"/>
+      </w:pPr>
+      <w:bookmarkStart w:id="9" w:name="_Toc240461300"/>
+      <w:r>
+        <w:t>2.6 Этап 6. Метрики и результаты</w:t>
+      </w:r>
+      <w:bookmarkEnd w:id="9"/>
+    </w:p>
+    <w:p>
+      <w:r>
+        <w:t>Мы выполнили все 120 запросов; 120 ответов прошли формальную валидацию и завершились stop. Хеши эталонов не изменились, фактические наборы B/C совпали. Израсходовано 688026 входных и 1623</w:t>
+      </w:r>
+      <w:r>
+        <w:t>1 выходной токен; суммарная наблюдаемая задержка составила 1030 с. Это один тёплый прогон, а не оценка холодного старта.</w:t>
       </w:r>
     </w:p>
     <w:p>
@@ -1285,7 +1763,13 @@
               <w:rPr>
                 <w:sz w:val="24"/>
               </w:rPr>
-              <w:t>Evidence recall</w:t>
+              <w:t xml:space="preserve">Evidence </w:t>
+            </w:r>
+            <w:r>
+              <w:rPr>
+                <w:sz w:val="24"/>
+              </w:rPr>
+              <w:t>recall</w:t>
             </w:r>
           </w:p>
         </w:tc>
@@ -1796,7 +2280,13 @@
               <w:rPr>
                 <w:sz w:val="24"/>
               </w:rPr>
-              <w:t>Входные токены, среднее</w:t>
+              <w:t xml:space="preserve">Входные </w:t>
+            </w:r>
+            <w:r>
+              <w:rPr>
+                <w:sz w:val="24"/>
+              </w:rPr>
+              <w:t>токены, среднее</w:t>
             </w:r>
           </w:p>
         </w:tc>
@@ -2007,17 +2497,14 @@
     </w:p>
     <w:p>
       <w:r>
-        <w:t>Accuracy измеряет только логический статус. Evidence-метрики усредняются по 12</w:t>
+        <w:t xml:space="preserve">Accuracy измеряет только логический статус. Evidence-метрики усредняются по 12 вопросам; recall контрдоказательств — только по двум </w:t>
       </w:r>
       <w:r>
-        <w:t xml:space="preserve"> вопросам; recall контрдоказательств — только по двум вопросам с непустым gold-counterevidence. Invalid-ответов нет. У B/C вход </w:t>
+        <w:t xml:space="preserve">вопросам с непустым gold-counterevidence. Invalid-ответов нет. У B/C вход </w:t>
       </w:r>
       <w:r>
         <w:lastRenderedPageBreak/>
-        <w:t>короче примерно на 90%, но accuracy статуса осталась той же: 7/12. Рост F1 ссылок не означает автоматически улучшения логическог</w:t>
-      </w:r>
-      <w:r>
-        <w:t>о ответа.</w:t>
+        <w:t>короче примерно на 90%, но accuracy статуса осталась той же: 7/12. Рост F1 ссылок не означает автоматически улучшения логического ответа.</w:t>
       </w:r>
     </w:p>
     <w:p>
@@ -2746,13 +3233,13 @@
     </w:p>
     <w:p>
       <w:r>
-        <w:t xml:space="preserve">Верный переход требует правильного </w:t>
+        <w:t xml:space="preserve">Верный переход требует правильного статуса и до, и после изменения; для добавления </w:t>
       </w:r>
       <w:r>
-        <w:t>статуса и до, и после изменения; для добавления противоречия здесь учитываются восемь вопросов с меняющимся gold. Доля уверенных ошибок считается при confidence≥0,8 среди десяти случаев gold=insufficient каждого режима во всех вариантах. После перестановки</w:t>
+        <w:t xml:space="preserve">противоречия здесь учитываются восемь вопросов с меняющимся gold. Доля уверенных ошибок считается при confidence≥0,8 среди десяти случаев gold=insufficient каждого режима во всех вариантах. После перестановки A изменил 9/12 статусов. B/C сохранили статусы </w:t>
       </w:r>
       <w:r>
-        <w:t xml:space="preserve"> A изменил 9/12 статусов. B/C сохранили статусы и evidence_ids: их контексты при этой перестановке байтово идентичны. Полные таблицы включают также калибровочные интервалы, precision/recall статусов и попарные различия B/C.</w:t>
+        <w:t>и evidence_ids: их контексты при этой перестановке байтово идентичны. Полные таблицы включают также калибровочные интервалы, precision/recall статусов и попарные различия B/C.</w:t>
       </w:r>
     </w:p>
     <w:p>
@@ -2762,61 +3249,70 @@
         <w:spacing w:before="240" w:after="240"/>
         <w:jc w:val="left"/>
       </w:pPr>
-      <w:bookmarkStart w:id="5" w:name="_Toc239791158"/>
+      <w:bookmarkStart w:id="10" w:name="_Toc240461301"/>
       <w:r>
-        <w:t>1.3 Обсуждение и ограничения</w:t>
+        <w:t>2.7 Этап 7. Анализ ошибок и ограничения</w:t>
       </w:r>
-      <w:bookmarkEnd w:id="5"/>
+      <w:bookmarkEnd w:id="10"/>
     </w:p>
     <w:p>
       <w:r>
-        <w:t>При</w:t>
+        <w:t>При чтении сохранённых ответов мы выявил</w:t>
       </w:r>
       <w:r>
-        <w:t xml:space="preserve"> чтении сохранённых ответов мы выявили три разных границы метрик. Q01/A имеет правильный status=entailed, но неверное время 18:15 вместо 18:12; F1=0 и confidence=1. В Q05/C исходные ссылки C06/C07 и времена верны, F1=1, однако модель ошибочно утверждает, ч</w:t>
-      </w:r>
-      <w:r>
-        <w:t xml:space="preserve">то 18:15 </w:t>
+        <w:t xml:space="preserve">и три разных границы метрик. Q01/A имеет правильный status=entailed, но неверное время 18:15 вместо 18:12; F1=0 и confidence=1. В Q05/C исходные ссылки C06/C07 и времена верны, F1=1, однако модель ошибочно утверждает, что 18:15 </w:t>
       </w:r>
       <w:r>
         <w:lastRenderedPageBreak/>
-        <w:t xml:space="preserve">следует после 18:20. После удаления C06 тот же режим подменяет право публикации правом чтения C05, сохраняя confidence=1 и F1=1 по оставшейся эталонной ссылке C07. Напротив, правильный отказ Q05/A после удаления получает F1=0 из-за пустого списка </w:t>
+        <w:t>следует после 18:20. После у</w:t>
       </w:r>
       <w:r>
-        <w:t>ссылок; его объяснение тоже неточно заявляет нехватку времени первого выпуска, хотя C07 сохранён.</w:t>
+        <w:t>даления C06 тот же режим подменяет право публикации правом чтения C05, сохраняя confidence=1 и F1=1 по оставшейся эталонной ссылке C07. Напротив, правильный отказ Q05/A после удаления получает F1=0 из-за пустого списка ссылок; его объяснение тоже неточно з</w:t>
+      </w:r>
+      <w:r>
+        <w:t>аявляет нехватку времени первого выпуска, хотя C07 сохранён.</w:t>
       </w:r>
     </w:p>
     <w:p>
       <w:r>
-        <w:t>Структура C помогла по метрике статуса в Q12 с добавленным противоречием: insufficient вместо ошибочного both у B. Однако объяснение C спутало искомый архив с</w:t>
+        <w:t xml:space="preserve">Структура C помогла по метрике статуса в Q12 с добавленным противоречием: insufficient вместо ошибочного both у B. Однако объяснение C спутало искомый архив с архивом репетиции, поэтому это лишь </w:t>
       </w:r>
       <w:r>
-        <w:t xml:space="preserve"> архивом репетиции, поэтому это лишь частичный успех. В Q04 с противоречием C проиграл B: проигнорировал доступный C37 и уверенно выбрал entailed вместо both. В Q07 C сослался на условия исключения полнее, чем B, но оба ошибочно противопоставили исключение</w:t>
+        <w:t>частичный успех. В Q04 с противоречием C проиграл B: проигнорировал доступный C37 и уверенно выбрал entailed вместо both. В Q07 C сослался на условия исключения полнее, чем B, но оба ошибочно противопоставили исключение общему запрету. Таким образом, p-adi</w:t>
       </w:r>
       <w:r>
-        <w:t xml:space="preserve"> общему запрету. Таким образом, p-adic упаковка улучшила некоторые ссылки, но не обеспечила правильного применения нормы.</w:t>
+        <w:t>c упаковка улучшила некоторые ссылки, но не обеспечила правильного применения нормы.</w:t>
       </w:r>
     </w:p>
     <w:p>
       <w:r>
-        <w:t>Исходные недостаточные вопросы распознаны всеми режимами, но после удаления посылки правильных отказов осталось 3/4, 1/4 и 0/4. Высока</w:t>
+        <w:t xml:space="preserve">Исходные недостаточные вопросы распознаны всеми режимами, но после удаления посылки правильных отказов осталось 3/4, 1/4 и 0/4. Высокая точность after-contradiction также </w:t>
       </w:r>
       <w:r>
-        <w:t>я точность after-contradiction также не равна правильной реакции: для Q07/Q08 модель выбирала both ещё до появления реального конфликта. Confidence не согласуется с достоверностью автоматически: уверенные ошибки соседствуют с confidence=0 у правильных отка</w:t>
+        <w:t xml:space="preserve">не равна правильной реакции: для Q07/Q08 модель выбирала both ещё до появления реального конфликта. Confidence не согласуется с достоверностью автоматически: уверенные ошибки соседствуют с confidence=0 у правильных отказов. Шкала не была строго определена </w:t>
       </w:r>
       <w:r>
-        <w:t>зов. Шкала не была строго определена как вероятность правильности статуса; калибровочная таблица поэтому является описательной диагностикой.</w:t>
+        <w:t>как вероятность правильности статуса; калибровочная таблица поэтому является описательной диагностикой.</w:t>
       </w:r>
     </w:p>
     <w:p>
       <w:r>
-        <w:t>Оценка evidence использует точные идентификаторы замороженного эталона. Альтернативная корректная ссылка на повторё</w:t>
+        <w:t xml:space="preserve">Оценка evidence использует точные идентификаторы замороженного эталона. Альтернативная корректная ссылка на повторённое разрешение координатора может </w:t>
       </w:r>
       <w:r>
-        <w:t>нное разрешение координатора может быть наказана этой метрикой; численная ошибка ссылки не всегда означает ложный смысл. Полные объяснения требуют отдельного чтения. Confidence является самооценкой модели, а не калиброванной вероятностью. Малый набор, один</w:t>
+        <w:t>быть наказана этой метрикой; численная ошибка ссылки не всегда означает ложный смысл. Полные объяснения требуют отдельного чтения. Confidence является самооценкой модели, а не калиброванной вероятностью. Малый набор, один сюжет, один seed и отсутствие повт</w:t>
       </w:r>
       <w:r>
-        <w:t xml:space="preserve"> сюжет, один seed и отсутствие повторных выборок не позволяют делать статистические выводы о превосходстве метода вообще.</w:t>
+        <w:t>орных выборок не позволяют делать статистические выводы о превосходстве метода вообще.</w:t>
+      </w:r>
+    </w:p>
+    <w:p>
+      <w:r>
+        <w:lastRenderedPageBreak/>
+        <w:t>Документированная предварительная проверка эталонов и стресс-вариантов выполнена ИИ-агентами. Выполнение требования о независимой ручной проверке всеми участниками до за</w:t>
+      </w:r>
+      <w:r>
+        <w:t>пуска модели не подтверждено; автоматические тесты эту проверку не заменяют.</w:t>
       </w:r>
     </w:p>
     <w:p>
@@ -2826,35 +3322,48 @@
         <w:spacing w:before="240" w:after="240"/>
         <w:jc w:val="left"/>
       </w:pPr>
-      <w:bookmarkStart w:id="6" w:name="_Toc239791159"/>
+      <w:bookmarkStart w:id="11" w:name="_Toc240461302"/>
       <w:r>
-        <w:lastRenderedPageBreak/>
-        <w:t>1.4 Вклад участников</w:t>
+        <w:t>2.8 Этап 8. Вклад участников и демонстрация</w:t>
       </w:r>
-      <w:bookmarkEnd w:id="6"/>
+      <w:bookmarkEnd w:id="11"/>
     </w:p>
     <w:p>
+      <w:pPr>
+        <w:keepLines/>
+      </w:pPr>
       <w:r>
-        <w:t>Дущенко Даниил Александрович подготовил сюжет, документы, атомарные утверждения, вопросы и первоначальные эталоны</w:t>
+        <w:t xml:space="preserve">Дущенко Даниил Александрович подготовил сюжет, документы, атомарные утверждения, вопросы и первоначальные эталоны. Он реализовал BM25, </w:t>
       </w:r>
       <w:r>
-        <w:t>. Он реализовал BM25, p-adic кодирование и расстояние, построение контекстов A/B/C и формирование стресс-вариантов.</w:t>
+        <w:t>p-adic кодирование и расстояние, построение контекстов A/B/C и формирование стресс-вариантов.</w:t>
+      </w:r>
+    </w:p>
+    <w:p>
+      <w:pPr>
+        <w:keepLines/>
+      </w:pPr>
+      <w:r>
+        <w:t>Коваленко Евгений Юрьевич реализовал взаимодействие с LLM, схемы и валидацию ответов, интерфейс Streamlit, автоматические тесты и расчёт метрик. Он подготовил ана</w:t>
+      </w:r>
+      <w:r>
+        <w:t>лиз сохранённых ответов, журнал AI_LOG и сценарий демонстрации.</w:t>
       </w:r>
     </w:p>
     <w:p>
       <w:r>
-        <w:t>Коваленко Евгений Юрьевич реализовал взаимодействие с LLM, схемы и валидацию ответов, интерфейс Streamlit, автоматические тесты и расчёт мет</w:t>
+        <w:t>Совместно мы согласовали протокол, рассмотрели логические ошибки эталонов и ограничения метрик, сопоставили три режима и подготовили отчёт. Разработка в режиме vibe coding и проверки предложен</w:t>
       </w:r>
       <w:r>
-        <w:t>рик. Он подготовил анализ сохранённых ответов, журнал AI_LOG и сценарий демонстрации.</w:t>
+        <w:t>ий LLM отражены в AI_LOG; исходники и результаты сохранены в репозитории.</w:t>
       </w:r>
     </w:p>
     <w:p>
       <w:r>
-        <w:t>Совместно мы согласовали протокол, рассмотрели логические ошибки эталонов и ограничения метрик, сопоставили три режима и подготовили отчёт. Разработка в режиме vibe codin</w:t>
+        <w:t>Подготовлен сценарий демонстрации на 6 минут 40 секунд: досье и эталоны, сравнение A/B/C, стресс-варианты, метрики и ограничения. Дущенко показывает данные, организацию контекста и и</w:t>
       </w:r>
       <w:r>
-        <w:t>g и проверки предложений LLM отражены в AI_LOG; исходники и результаты сохранены в репозитории.</w:t>
+        <w:t>зменение посылок; Коваленко — ответы, интерфейс, результаты и тесты. Сценарий находится в demonstration.md.</w:t>
       </w:r>
     </w:p>
     <w:p>
@@ -2866,22 +3375,22 @@
         <w:ind w:firstLine="0"/>
         <w:jc w:val="center"/>
       </w:pPr>
-      <w:bookmarkStart w:id="7" w:name="_Toc239791160"/>
+      <w:bookmarkStart w:id="12" w:name="_Toc240461303"/>
       <w:r>
         <w:lastRenderedPageBreak/>
         <w:t>ЗАКЛЮЧЕНИЕ</w:t>
       </w:r>
-      <w:bookmarkEnd w:id="7"/>
+      <w:bookmarkEnd w:id="12"/>
     </w:p>
     <w:p>
       <w:r>
-        <w:t>На этом досье retrieval сократил вход и время, сохранив accuracy статуса, но изменив характер ошибок. p-adic группировка повысила исходный F1 ссылок,</w:t>
+        <w:t xml:space="preserve">На этом досье retrieval сократил вход и время, сохранив accuracy статуса, но изменив характер ошибок. p-adic группировка повысила </w:t>
       </w:r>
       <w:r>
-        <w:t xml:space="preserve"> не улучшила accuracy и оказалась слабее после удаления посылки. Полный контекст сильно зависел от порядка документов. Главный результат — воспроизводимое разделение доступности доказательств, выбора ссылок, логического статуса и содержания объяснения; ни </w:t>
+        <w:t>исходный F1 ссылок, не улучшила accuracy и оказалась слабее после удаления посылки. Полный контекст сильно зависел от порядка документов. Главный результат — воспроизводимое разделение доступности доказательств, выбора ссылок, логического статуса и содержа</w:t>
       </w:r>
       <w:r>
-        <w:t>один из этих показателей нельзя подменять другим.</w:t>
+        <w:t>ния объяснения; ни один из этих показателей нельзя подменять другим.</w:t>
       </w:r>
     </w:p>
     <w:p>
@@ -2893,12 +3402,12 @@
         <w:ind w:firstLine="0"/>
         <w:jc w:val="center"/>
       </w:pPr>
-      <w:bookmarkStart w:id="8" w:name="_Toc239791161"/>
+      <w:bookmarkStart w:id="13" w:name="_Toc240461304"/>
       <w:r>
         <w:lastRenderedPageBreak/>
         <w:t>СПИСОК ИСПОЛЬЗОВАННЫХ ИСТОЧНИКОВ</w:t>
       </w:r>
-      <w:bookmarkEnd w:id="8"/>
+      <w:bookmarkEnd w:id="13"/>
     </w:p>
     <w:p>
       <w:r>
@@ -2907,23 +3416,23 @@
     </w:p>
     <w:p>
       <w:r>
-        <w:t xml:space="preserve">[2] Pydantic. Models: </w:t>
+        <w:t>[2] Pydanti</w:t>
       </w:r>
       <w:r>
-        <w:t>документация. URL: https://docs.pydantic.dev/latest/concepts/models/ (дата обращения: 08.09.2026).</w:t>
+        <w:t>c. Models: документация. URL: https://docs.pydantic.dev/latest/concepts/models/ (дата обращения: 08.09.2026).</w:t>
       </w:r>
     </w:p>
     <w:p>
       <w:r>
-        <w:t>[3] LM Studio. OpenAI Compatibility Endpoints: документация API. URL: https://lmstudio.ai/docs/developer/openai-compat (дата обращения: 08.09.2026).</w:t>
+        <w:t>[3] LM Studio. OpenAI Compatibility Endpoints: документация API. URL: https://lmstudio.ai/docs/developer/openai-compat (дата обращения: 08.09.2026</w:t>
+      </w:r>
+      <w:r>
+        <w:t>).</w:t>
       </w:r>
     </w:p>
     <w:p>
       <w:r>
-        <w:t>[4] Stre</w:t>
-      </w:r>
-      <w:r>
-        <w:t>amlit. Documentation. URL: https://docs.streamlit.io/ (дата обращения: 08.09.2026).</w:t>
+        <w:t>[4] Streamlit. Documentation. URL: https://docs.streamlit.io/ (дата обращения: 08.09.2026).</w:t>
       </w:r>
     </w:p>
     <w:sectPr>
@@ -14983,7 +15492,7 @@
 </file>
 
 <file path=customXml/itemProps1.xml><?xml version="1.0" encoding="utf-8"?>
-<ds:datastoreItem xmlns:ds="http://schemas.openxmlformats.org/officeDocument/2006/customXml" ds:itemID="{6CF2410A-C368-4F3F-AB59-2AE99EEC1B6D}">
+<ds:datastoreItem xmlns:ds="http://schemas.openxmlformats.org/officeDocument/2006/customXml" ds:itemID="{AB9ECAEF-7700-4BC2-9093-A26178D4EB2E}">
   <ds:schemaRefs>
     <ds:schemaRef ds:uri="http://schemas.openxmlformats.org/officeDocument/2006/bibliography"/>
   </ds:schemaRefs>

</xml_diff>